<commit_message>
Atualiza relatório final do AutoStock
</commit_message>
<xml_diff>
--- a/programação-orientada-a-objetos/documentos/Relatório Explicativo-programação-orientada-a-objetos.docx
+++ b/programação-orientada-a-objetos/documentos/Relatório Explicativo-programação-orientada-a-objetos.docx
@@ -13940,22 +13940,6 @@
           <w:rFonts w:ascii="Arial" w:hAnsi="Arial" w:cs="Arial"/>
           <w:sz w:val="22"/>
         </w:rPr>
-        <w:t>E deixe provisoriamente a última referência assim no Word:</w:t>
-      </w:r>
-    </w:p>
-    <w:p>
-      <w:pPr>
-        <w:pStyle w:val="NormalWeb"/>
-        <w:rPr>
-          <w:rFonts w:ascii="Arial" w:hAnsi="Arial" w:cs="Arial"/>
-          <w:sz w:val="22"/>
-        </w:rPr>
-      </w:pPr>
-      <w:r>
-        <w:rPr>
-          <w:rFonts w:ascii="Arial" w:hAnsi="Arial" w:cs="Arial"/>
-          <w:sz w:val="22"/>
-        </w:rPr>
         <w:t xml:space="preserve">MANTOAN, Adriano. </w:t>
       </w:r>
       <w:proofErr w:type="spellStart"/>
@@ -14109,6 +14093,7 @@
         <w:docPartUnique/>
       </w:docPartObj>
     </w:sdtPr>
+    <w:sdtEndPr/>
     <w:sdtContent>
       <w:p>
         <w:pPr>
@@ -41014,7 +40999,7 @@
 </file>
 
 <file path=customXml/itemProps1.xml><?xml version="1.0" encoding="utf-8"?>
-<ds:datastoreItem xmlns:ds="http://schemas.openxmlformats.org/officeDocument/2006/customXml" ds:itemID="{960AB763-C341-4449-A445-449394FE9F3E}">
+<ds:datastoreItem xmlns:ds="http://schemas.openxmlformats.org/officeDocument/2006/customXml" ds:itemID="{41284D53-E468-4A1A-9D33-F587612A4A1D}">
   <ds:schemaRefs>
     <ds:schemaRef ds:uri="http://schemas.openxmlformats.org/officeDocument/2006/bibliography"/>
   </ds:schemaRefs>

</xml_diff>